<commit_message>
Rename project reports and add working procedure documentation
</commit_message>
<xml_diff>
--- a/SEM_7/PRPWA/Cover Page and Content page.docx
+++ b/SEM_7/PRPWA/Cover Page and Content page.docx
@@ -40,7 +40,27 @@
           <w:sz w:val="40"/>
           <w:szCs w:val="28"/>
         </w:rPr>
-        <w:t xml:space="preserve">PRACTICLE ROBOTICS PROJECTS WITH ARDUINO </w:t>
+        <w:t>PRACTIC</w:t>
+      </w:r>
+      <w:r>
+        <w:rPr>
+          <w:rFonts w:hint="default"/>
+          <w:b/>
+          <w:bCs/>
+          <w:sz w:val="40"/>
+          <w:szCs w:val="28"/>
+          <w:lang w:val="en-US"/>
+        </w:rPr>
+        <w:t>AL</w:t>
+      </w:r>
+      <w:r>
+        <w:rPr>
+          <w:b/>
+          <w:bCs/>
+          <w:sz w:val="40"/>
+          <w:szCs w:val="28"/>
+        </w:rPr>
+        <w:t xml:space="preserve"> ROBOTICS PROJECTS WITH ARDUINO </w:t>
       </w:r>
     </w:p>
     <w:p>
@@ -80,6 +100,8 @@
         </w:rPr>
         <w:tab/>
       </w:r>
+      <w:bookmarkStart w:id="0" w:name="_GoBack"/>
+      <w:bookmarkEnd w:id="0"/>
     </w:p>
     <w:p>
       <w:pPr>
@@ -166,8 +188,6 @@
           <w:sz w:val="32"/>
         </w:rPr>
       </w:pPr>
-      <w:bookmarkStart w:id="0" w:name="_GoBack"/>
-      <w:bookmarkEnd w:id="0"/>
     </w:p>
     <w:p>
       <w:pPr>

</xml_diff>